<commit_message>
correcciones para tablas de modulos
</commit_message>
<xml_diff>
--- a/docs/TablaModulos_ElMapitaUTB.docx
+++ b/docs/TablaModulos_ElMapitaUTB.docx
@@ -18,12 +18,7 @@
     </w:p>
     <w:p>
       <w:r>
-        <w:t>Alcance del documento: commit b28e068 (rama main), posterior al cierre del corte 1 (commit 4806374, tag corte-1 → d3be514).</w:t>
-      </w:r>
-    </w:p>
-    <w:p>
-      <w:r>
-        <w:t>Fecha de elaboración: 12 de septiembre de 2026.</w:t>
+        <w:t>Fecha de elaboración: 13 de septiembre de 2026.</w:t>
       </w:r>
     </w:p>
     <w:p>
@@ -33,7 +28,12 @@
     </w:p>
     <w:p>
       <w:r>
-        <w:t>Nota: la asignación de dueño único parte del reparto de trabajo declarado en ADR-0001 (Dev 1: mapas + pois · Dev 2: ubicación + auth · Dev 3: core/shared + CI/CD + adaptador de render 3D), con nombres propuestos según la evidencia de autoría disponible en el historial de Git. Es una propuesta inicial sujeta a corrección por el equipo.</w:t>
+        <w:t>Nota sobre dueños: la asignación de dueño único parte del reparto de trabajo declarado en ADR-0001 (Dev 1: mapas + pois · Dev 2: ubicación + auth · Dev 3: core/shared + CI/CD + adaptador de render 3D), con nombres propuestos según la evidencia de autoría disponible en el historial de Git. Es una propuesta inicial sujeta a corrección por el equipo.</w:t>
+      </w:r>
+    </w:p>
+    <w:p>
+      <w:r>
+        <w:t>Nota sobre los hallazgos: provienen del panel de análisis estático de seguridad y confiabilidad del repositorio ("Security snapshot" / "Reliability snapshot"). Cada uno fue verificado manualmente contra el archivo y la línea señalados antes de incluirse en este documento.</w:t>
       </w:r>
     </w:p>
     <w:p>
@@ -41,7 +41,7 @@
         <w:pStyle w:val="Heading2"/>
       </w:pPr>
       <w:r>
-        <w:t>1. Módulos, dueño único y no conformidades</w:t>
+        <w:t>1. Módulos, dueño único y hallazgos</w:t>
       </w:r>
     </w:p>
     <w:tbl>
@@ -52,25 +52,25 @@
         <w:tblLook w:firstColumn="1" w:firstRow="1" w:lastColumn="0" w:lastRow="0" w:noHBand="0" w:noVBand="1" w:val="04A0"/>
       </w:tblPr>
       <w:tblGrid>
-        <w:gridCol w:w="2020"/>
-        <w:gridCol w:w="2020"/>
-        <w:gridCol w:w="2020"/>
-        <w:gridCol w:w="2020"/>
-        <w:gridCol w:w="2020"/>
-        <w:gridCol w:w="2020"/>
-        <w:gridCol w:w="2020"/>
+        <w:gridCol w:w="1971"/>
+        <w:gridCol w:w="1971"/>
+        <w:gridCol w:w="1971"/>
+        <w:gridCol w:w="1971"/>
+        <w:gridCol w:w="1971"/>
+        <w:gridCol w:w="1971"/>
+        <w:gridCol w:w="1971"/>
       </w:tblGrid>
       <w:tr>
         <w:tc>
           <w:tcPr>
             <w:tcW w:type="dxa" w:w="567"/>
-            <w:shd w:val="clear" w:color="auto" w:fill="1F4E78"/>
+            <w:shd w:val="clear" w:color="auto" w:fill="D9D9D9"/>
           </w:tcPr>
           <w:p>
             <w:r>
               <w:rPr>
                 <w:b/>
-                <w:color w:val="FFFFFF"/>
+                <w:color w:val="000000"/>
               </w:rPr>
               <w:t>#</w:t>
             </w:r>
@@ -78,14 +78,14 @@
         </w:tc>
         <w:tc>
           <w:tcPr>
-            <w:tcW w:type="dxa" w:w="1587"/>
-            <w:shd w:val="clear" w:color="auto" w:fill="1F4E78"/>
+            <w:tcW w:type="dxa" w:w="1701"/>
+            <w:shd w:val="clear" w:color="auto" w:fill="D9D9D9"/>
           </w:tcPr>
           <w:p>
             <w:r>
               <w:rPr>
                 <w:b/>
-                <w:color w:val="FFFFFF"/>
+                <w:color w:val="000000"/>
               </w:rPr>
               <w:t>Módulo</w:t>
             </w:r>
@@ -94,13 +94,13 @@
         <w:tc>
           <w:tcPr>
             <w:tcW w:type="dxa" w:w="1247"/>
-            <w:shd w:val="clear" w:color="auto" w:fill="1F4E78"/>
+            <w:shd w:val="clear" w:color="auto" w:fill="D9D9D9"/>
           </w:tcPr>
           <w:p>
             <w:r>
               <w:rPr>
                 <w:b/>
-                <w:color w:val="FFFFFF"/>
+                <w:color w:val="000000"/>
               </w:rPr>
               <w:t>Capa</w:t>
             </w:r>
@@ -108,14 +108,14 @@
         </w:tc>
         <w:tc>
           <w:tcPr>
-            <w:tcW w:type="dxa" w:w="3685"/>
-            <w:shd w:val="clear" w:color="auto" w:fill="1F4E78"/>
+            <w:tcW w:type="dxa" w:w="3572"/>
+            <w:shd w:val="clear" w:color="auto" w:fill="D9D9D9"/>
           </w:tcPr>
           <w:p>
             <w:r>
               <w:rPr>
                 <w:b/>
-                <w:color w:val="FFFFFF"/>
+                <w:color w:val="000000"/>
               </w:rPr>
               <w:t>Ruta en el repositorio</w:t>
             </w:r>
@@ -124,13 +124,13 @@
         <w:tc>
           <w:tcPr>
             <w:tcW w:type="dxa" w:w="2268"/>
-            <w:shd w:val="clear" w:color="auto" w:fill="1F4E78"/>
+            <w:shd w:val="clear" w:color="auto" w:fill="D9D9D9"/>
           </w:tcPr>
           <w:p>
             <w:r>
               <w:rPr>
                 <w:b/>
-                <w:color w:val="FFFFFF"/>
+                <w:color w:val="000000"/>
               </w:rPr>
               <w:t>Dueño único</w:t>
             </w:r>
@@ -139,13 +139,13 @@
         <w:tc>
           <w:tcPr>
             <w:tcW w:type="dxa" w:w="3402"/>
-            <w:shd w:val="clear" w:color="auto" w:fill="1F4E78"/>
+            <w:shd w:val="clear" w:color="auto" w:fill="D9D9D9"/>
           </w:tcPr>
           <w:p>
             <w:r>
               <w:rPr>
                 <w:b/>
-                <w:color w:val="FFFFFF"/>
+                <w:color w:val="000000"/>
               </w:rPr>
               <w:t>Responsabilidad</w:t>
             </w:r>
@@ -154,15 +154,15 @@
         <w:tc>
           <w:tcPr>
             <w:tcW w:type="dxa" w:w="1417"/>
-            <w:shd w:val="clear" w:color="auto" w:fill="1F4E78"/>
+            <w:shd w:val="clear" w:color="auto" w:fill="D9D9D9"/>
           </w:tcPr>
           <w:p>
             <w:r>
               <w:rPr>
                 <w:b/>
-                <w:color w:val="FFFFFF"/>
+                <w:color w:val="000000"/>
               </w:rPr>
-              <w:t>No conformidades</w:t>
+              <w:t>Hallazgos</w:t>
             </w:r>
           </w:p>
         </w:tc>
@@ -180,7 +180,7 @@
         </w:tc>
         <w:tc>
           <w:tcPr>
-            <w:tcW w:type="dxa" w:w="1587"/>
+            <w:tcW w:type="dxa" w:w="1701"/>
           </w:tcPr>
           <w:p>
             <w:r>
@@ -200,7 +200,7 @@
         </w:tc>
         <w:tc>
           <w:tcPr>
-            <w:tcW w:type="dxa" w:w="3685"/>
+            <w:tcW w:type="dxa" w:w="3572"/>
           </w:tcPr>
           <w:p>
             <w:r>
@@ -234,7 +234,7 @@
           </w:tcPr>
           <w:p>
             <w:r>
-              <w:t>NC-01, NC-02</w:t>
+              <w:t>Sin hallazgos en este corte</w:t>
             </w:r>
           </w:p>
         </w:tc>
@@ -252,7 +252,7 @@
         </w:tc>
         <w:tc>
           <w:tcPr>
-            <w:tcW w:type="dxa" w:w="1587"/>
+            <w:tcW w:type="dxa" w:w="1701"/>
           </w:tcPr>
           <w:p>
             <w:r>
@@ -272,7 +272,7 @@
         </w:tc>
         <w:tc>
           <w:tcPr>
-            <w:tcW w:type="dxa" w:w="3685"/>
+            <w:tcW w:type="dxa" w:w="3572"/>
           </w:tcPr>
           <w:p>
             <w:r>
@@ -306,7 +306,7 @@
           </w:tcPr>
           <w:p>
             <w:r>
-              <w:t>NC-08</w:t>
+              <w:t>Sin hallazgos en este corte</w:t>
             </w:r>
           </w:p>
         </w:tc>
@@ -324,7 +324,7 @@
         </w:tc>
         <w:tc>
           <w:tcPr>
-            <w:tcW w:type="dxa" w:w="1587"/>
+            <w:tcW w:type="dxa" w:w="1701"/>
           </w:tcPr>
           <w:p>
             <w:r>
@@ -344,7 +344,7 @@
         </w:tc>
         <w:tc>
           <w:tcPr>
-            <w:tcW w:type="dxa" w:w="3685"/>
+            <w:tcW w:type="dxa" w:w="3572"/>
           </w:tcPr>
           <w:p>
             <w:r>
@@ -378,7 +378,7 @@
           </w:tcPr>
           <w:p>
             <w:r>
-              <w:t>NC-01, NC-02, NC-04</w:t>
+              <w:t>Sin hallazgos en este corte</w:t>
             </w:r>
           </w:p>
         </w:tc>
@@ -396,7 +396,7 @@
         </w:tc>
         <w:tc>
           <w:tcPr>
-            <w:tcW w:type="dxa" w:w="1587"/>
+            <w:tcW w:type="dxa" w:w="1701"/>
           </w:tcPr>
           <w:p>
             <w:r>
@@ -416,7 +416,7 @@
         </w:tc>
         <w:tc>
           <w:tcPr>
-            <w:tcW w:type="dxa" w:w="3685"/>
+            <w:tcW w:type="dxa" w:w="3572"/>
           </w:tcPr>
           <w:p>
             <w:r>
@@ -450,7 +450,7 @@
           </w:tcPr>
           <w:p>
             <w:r>
-              <w:t>NC-05, NC-08, NC-09</w:t>
+              <w:t>Sin hallazgos en este corte</w:t>
             </w:r>
           </w:p>
         </w:tc>
@@ -468,7 +468,7 @@
         </w:tc>
         <w:tc>
           <w:tcPr>
-            <w:tcW w:type="dxa" w:w="1587"/>
+            <w:tcW w:type="dxa" w:w="1701"/>
           </w:tcPr>
           <w:p>
             <w:r>
@@ -488,7 +488,7 @@
         </w:tc>
         <w:tc>
           <w:tcPr>
-            <w:tcW w:type="dxa" w:w="3685"/>
+            <w:tcW w:type="dxa" w:w="3572"/>
           </w:tcPr>
           <w:p>
             <w:r>
@@ -522,7 +522,7 @@
           </w:tcPr>
           <w:p>
             <w:r>
-              <w:t>NC-01, NC-02</w:t>
+              <w:t>Sin hallazgos en este corte</w:t>
             </w:r>
           </w:p>
         </w:tc>
@@ -540,7 +540,7 @@
         </w:tc>
         <w:tc>
           <w:tcPr>
-            <w:tcW w:type="dxa" w:w="1587"/>
+            <w:tcW w:type="dxa" w:w="1701"/>
           </w:tcPr>
           <w:p>
             <w:r>
@@ -560,7 +560,7 @@
         </w:tc>
         <w:tc>
           <w:tcPr>
-            <w:tcW w:type="dxa" w:w="3685"/>
+            <w:tcW w:type="dxa" w:w="3572"/>
           </w:tcPr>
           <w:p>
             <w:r>
@@ -594,7 +594,7 @@
           </w:tcPr>
           <w:p>
             <w:r>
-              <w:t>NC-06, NC-08</w:t>
+              <w:t>Sin hallazgos en este corte</w:t>
             </w:r>
           </w:p>
         </w:tc>
@@ -612,7 +612,7 @@
         </w:tc>
         <w:tc>
           <w:tcPr>
-            <w:tcW w:type="dxa" w:w="1587"/>
+            <w:tcW w:type="dxa" w:w="1701"/>
           </w:tcPr>
           <w:p>
             <w:r>
@@ -632,7 +632,7 @@
         </w:tc>
         <w:tc>
           <w:tcPr>
-            <w:tcW w:type="dxa" w:w="3685"/>
+            <w:tcW w:type="dxa" w:w="3572"/>
           </w:tcPr>
           <w:p>
             <w:r>
@@ -666,7 +666,7 @@
           </w:tcPr>
           <w:p>
             <w:r>
-              <w:t>NC-02, NC-03</w:t>
+              <w:t>Sin hallazgos en este corte</w:t>
             </w:r>
           </w:p>
         </w:tc>
@@ -684,7 +684,7 @@
         </w:tc>
         <w:tc>
           <w:tcPr>
-            <w:tcW w:type="dxa" w:w="1587"/>
+            <w:tcW w:type="dxa" w:w="1701"/>
           </w:tcPr>
           <w:p>
             <w:r>
@@ -704,7 +704,7 @@
         </w:tc>
         <w:tc>
           <w:tcPr>
-            <w:tcW w:type="dxa" w:w="3685"/>
+            <w:tcW w:type="dxa" w:w="3572"/>
           </w:tcPr>
           <w:p>
             <w:r>
@@ -738,7 +738,7 @@
           </w:tcPr>
           <w:p>
             <w:r>
-              <w:t>NC-03, NC-08</w:t>
+              <w:t>Sin hallazgos en este corte</w:t>
             </w:r>
           </w:p>
         </w:tc>
@@ -756,7 +756,7 @@
         </w:tc>
         <w:tc>
           <w:tcPr>
-            <w:tcW w:type="dxa" w:w="1587"/>
+            <w:tcW w:type="dxa" w:w="1701"/>
           </w:tcPr>
           <w:p>
             <w:r>
@@ -776,7 +776,7 @@
         </w:tc>
         <w:tc>
           <w:tcPr>
-            <w:tcW w:type="dxa" w:w="3685"/>
+            <w:tcW w:type="dxa" w:w="3572"/>
           </w:tcPr>
           <w:p>
             <w:r>
@@ -810,7 +810,7 @@
           </w:tcPr>
           <w:p>
             <w:r>
-              <w:t>NC-07, NC-08</w:t>
+              <w:t>Sin hallazgos en este corte</w:t>
             </w:r>
           </w:p>
         </w:tc>
@@ -828,7 +828,7 @@
         </w:tc>
         <w:tc>
           <w:tcPr>
-            <w:tcW w:type="dxa" w:w="1587"/>
+            <w:tcW w:type="dxa" w:w="1701"/>
           </w:tcPr>
           <w:p>
             <w:r>
@@ -848,7 +848,7 @@
         </w:tc>
         <w:tc>
           <w:tcPr>
-            <w:tcW w:type="dxa" w:w="3685"/>
+            <w:tcW w:type="dxa" w:w="3572"/>
           </w:tcPr>
           <w:p>
             <w:r>
@@ -882,7 +882,7 @@
           </w:tcPr>
           <w:p>
             <w:r>
-              <w:t>NC-02</w:t>
+              <w:t>Sin hallazgos en este corte</w:t>
             </w:r>
           </w:p>
         </w:tc>
@@ -900,7 +900,7 @@
         </w:tc>
         <w:tc>
           <w:tcPr>
-            <w:tcW w:type="dxa" w:w="1587"/>
+            <w:tcW w:type="dxa" w:w="1701"/>
           </w:tcPr>
           <w:p>
             <w:r>
@@ -920,7 +920,7 @@
         </w:tc>
         <w:tc>
           <w:tcPr>
-            <w:tcW w:type="dxa" w:w="3685"/>
+            <w:tcW w:type="dxa" w:w="3572"/>
           </w:tcPr>
           <w:p>
             <w:r>
@@ -954,7 +954,7 @@
           </w:tcPr>
           <w:p>
             <w:r>
-              <w:t>NC-08</w:t>
+              <w:t>Sin hallazgos en este corte</w:t>
             </w:r>
           </w:p>
         </w:tc>
@@ -972,7 +972,7 @@
         </w:tc>
         <w:tc>
           <w:tcPr>
-            <w:tcW w:type="dxa" w:w="1587"/>
+            <w:tcW w:type="dxa" w:w="1701"/>
           </w:tcPr>
           <w:p>
             <w:r>
@@ -992,7 +992,7 @@
         </w:tc>
         <w:tc>
           <w:tcPr>
-            <w:tcW w:type="dxa" w:w="3685"/>
+            <w:tcW w:type="dxa" w:w="3572"/>
           </w:tcPr>
           <w:p>
             <w:r>
@@ -1016,7 +1016,7 @@
           </w:tcPr>
           <w:p>
             <w:r>
-              <w:t>Pipeline de integración continua y quality gate</w:t>
+              <w:t>Pipeline de integración continua y scripts de desarrollo</w:t>
             </w:r>
           </w:p>
         </w:tc>
@@ -1026,7 +1026,7 @@
           </w:tcPr>
           <w:p>
             <w:r>
-              <w:t>NC-10, NC-11</w:t>
+              <w:t>H-01, H-02, H-04, H-05, H-09</w:t>
             </w:r>
           </w:p>
         </w:tc>
@@ -1044,7 +1044,79 @@
         </w:tc>
         <w:tc>
           <w:tcPr>
-            <w:tcW w:type="dxa" w:w="1587"/>
+            <w:tcW w:type="dxa" w:w="1701"/>
+          </w:tcPr>
+          <w:p>
+            <w:r>
+              <w:t>configuración de plataforma (Android / Web)</w:t>
+            </w:r>
+          </w:p>
+        </w:tc>
+        <w:tc>
+          <w:tcPr>
+            <w:tcW w:type="dxa" w:w="1247"/>
+          </w:tcPr>
+          <w:p>
+            <w:r>
+              <w:t>Transversal</w:t>
+            </w:r>
+          </w:p>
+        </w:tc>
+        <w:tc>
+          <w:tcPr>
+            <w:tcW w:type="dxa" w:w="3572"/>
+          </w:tcPr>
+          <w:p>
+            <w:r>
+              <w:t>frontend/android/, frontend/web/</w:t>
+            </w:r>
+          </w:p>
+        </w:tc>
+        <w:tc>
+          <w:tcPr>
+            <w:tcW w:type="dxa" w:w="2268"/>
+          </w:tcPr>
+          <w:p>
+            <w:r>
+              <w:t>Angel Fabian Gutierrez Gomez</w:t>
+            </w:r>
+          </w:p>
+        </w:tc>
+        <w:tc>
+          <w:tcPr>
+            <w:tcW w:type="dxa" w:w="3402"/>
+          </w:tcPr>
+          <w:p>
+            <w:r>
+              <w:t>Manifiesto Android, build de Gradle y punto de entrada web</w:t>
+            </w:r>
+          </w:p>
+        </w:tc>
+        <w:tc>
+          <w:tcPr>
+            <w:tcW w:type="dxa" w:w="1417"/>
+          </w:tcPr>
+          <w:p>
+            <w:r>
+              <w:t>H-03, H-06, H-07, H-08, H-10</w:t>
+            </w:r>
+          </w:p>
+        </w:tc>
+      </w:tr>
+      <w:tr>
+        <w:tc>
+          <w:tcPr>
+            <w:tcW w:type="dxa" w:w="567"/>
+          </w:tcPr>
+          <w:p>
+            <w:r>
+              <w:t>14</w:t>
+            </w:r>
+          </w:p>
+        </w:tc>
+        <w:tc>
+          <w:tcPr>
+            <w:tcW w:type="dxa" w:w="1701"/>
           </w:tcPr>
           <w:p>
             <w:r>
@@ -1064,7 +1136,7 @@
         </w:tc>
         <w:tc>
           <w:tcPr>
-            <w:tcW w:type="dxa" w:w="3685"/>
+            <w:tcW w:type="dxa" w:w="3572"/>
           </w:tcPr>
           <w:p>
             <w:r>
@@ -1098,7 +1170,7 @@
           </w:tcPr>
           <w:p>
             <w:r>
-              <w:t>NC-04, NC-07, NC-12</w:t>
+              <w:t>Sin hallazgos en este corte</w:t>
             </w:r>
           </w:p>
         </w:tc>
@@ -1110,7 +1182,7 @@
         <w:pStyle w:val="Heading2"/>
       </w:pPr>
       <w:r>
-        <w:t>2. Catálogo de no conformidades</w:t>
+        <w:t>2. Resumen de hallazgos por dueño</w:t>
       </w:r>
     </w:p>
     <w:tbl>
@@ -1121,53 +1193,69 @@
         <w:tblLook w:firstColumn="1" w:firstRow="1" w:lastColumn="0" w:lastRow="0" w:noHBand="0" w:noVBand="1" w:val="04A0"/>
       </w:tblPr>
       <w:tblGrid>
-        <w:gridCol w:w="4713"/>
-        <w:gridCol w:w="4713"/>
-        <w:gridCol w:w="4713"/>
+        <w:gridCol w:w="3450"/>
+        <w:gridCol w:w="3450"/>
+        <w:gridCol w:w="3450"/>
+        <w:gridCol w:w="3450"/>
       </w:tblGrid>
       <w:tr>
         <w:tc>
           <w:tcPr>
-            <w:tcW w:type="dxa" w:w="1020"/>
-            <w:shd w:val="clear" w:color="auto" w:fill="1F4E78"/>
+            <w:tcW w:type="dxa" w:w="3402"/>
+            <w:shd w:val="clear" w:color="auto" w:fill="D9D9D9"/>
           </w:tcPr>
           <w:p>
             <w:r>
               <w:rPr>
                 <w:b/>
-                <w:color w:val="FFFFFF"/>
+                <w:color w:val="000000"/>
               </w:rPr>
-              <w:t>Código</w:t>
+              <w:t>Dueño único</w:t>
             </w:r>
           </w:p>
         </w:tc>
         <w:tc>
           <w:tcPr>
-            <w:tcW w:type="dxa" w:w="7370"/>
-            <w:shd w:val="clear" w:color="auto" w:fill="1F4E78"/>
+            <w:tcW w:type="dxa" w:w="5102"/>
+            <w:shd w:val="clear" w:color="auto" w:fill="D9D9D9"/>
           </w:tcPr>
           <w:p>
             <w:r>
               <w:rPr>
                 <w:b/>
-                <w:color w:val="FFFFFF"/>
+                <w:color w:val="000000"/>
               </w:rPr>
-              <w:t>Descripción</w:t>
+              <w:t>Módulos a cargo con hallazgos</w:t>
             </w:r>
           </w:p>
         </w:tc>
         <w:tc>
           <w:tcPr>
-            <w:tcW w:type="dxa" w:w="5783"/>
-            <w:shd w:val="clear" w:color="auto" w:fill="1F4E78"/>
+            <w:tcW w:type="dxa" w:w="4535"/>
+            <w:shd w:val="clear" w:color="auto" w:fill="D9D9D9"/>
           </w:tcPr>
           <w:p>
             <w:r>
               <w:rPr>
                 <w:b/>
-                <w:color w:val="FFFFFF"/>
+                <w:color w:val="000000"/>
               </w:rPr>
-              <w:t>Evidencia</w:t>
+              <w:t>Hallazgos abiertos</w:t>
+            </w:r>
+          </w:p>
+        </w:tc>
+        <w:tc>
+          <w:tcPr>
+            <w:tcW w:type="dxa" w:w="2551"/>
+            <w:shd w:val="clear" w:color="auto" w:fill="D9D9D9"/>
+          </w:tcPr>
+          <w:p>
+            <w:r>
+              <w:rPr>
+                <w:b/>
+                <w:color w:val="000000"/>
+              </w:rPr>
+              <w:t>Falsos positivos justificados</w:t>
             </w:r>
           </w:p>
         </w:tc>
@@ -1175,452 +1263,41 @@
       <w:tr>
         <w:tc>
           <w:tcPr>
-            <w:tcW w:type="dxa" w:w="1020"/>
+            <w:tcW w:type="dxa" w:w="3402"/>
           </w:tcPr>
           <w:p>
             <w:r>
-              <w:t>NC-01</w:t>
-            </w:r>
-          </w:p>
-        </w:tc>
-        <w:tc>
-          <w:tcPr>
-            <w:tcW w:type="dxa" w:w="7370"/>
-          </w:tcPr>
-          <w:p>
-            <w:r>
-              <w:t>10 usos de "any" sin tipar en adaptadores de Supabase; las reglas no-unsafe-assignment y no-unsafe-member-access de recommendedTypeChecked quedan en error, por lo que "npm run lint" falla.</w:t>
-            </w:r>
-          </w:p>
-        </w:tc>
-        <w:tc>
-          <w:tcPr>
-            <w:tcW w:type="dxa" w:w="5783"/>
-          </w:tcPr>
-          <w:p>
-            <w:r>
-              <w:t>backend/eslint.config.mjs:12; supabase-auth-client.ts:91; auth.controller.ts:54; supabase-repositories.ts:46,90,99; mapas.controller.ts:27,36; supabase-poi-repository.ts:60; pois.controller.ts:21,29</w:t>
-            </w:r>
-          </w:p>
-        </w:tc>
-      </w:tr>
-      <w:tr>
-        <w:tc>
-          <w:tcPr>
-            <w:tcW w:type="dxa" w:w="1020"/>
-          </w:tcPr>
-          <w:p>
-            <w:r>
-              <w:t>NC-02</w:t>
-            </w:r>
-          </w:p>
-        </w:tc>
-        <w:tc>
-          <w:tcPr>
-            <w:tcW w:type="dxa" w:w="7370"/>
-          </w:tcPr>
-          <w:p>
-            <w:r>
-              <w:t>Ningún módulo de negocio del backend tiene pruebas unitarias propias; solo existe una prueba genérica del controlador raíz.</w:t>
-            </w:r>
-          </w:p>
-        </w:tc>
-        <w:tc>
-          <w:tcPr>
-            <w:tcW w:type="dxa" w:w="5783"/>
-          </w:tcPr>
-          <w:p>
-            <w:r>
-              <w:t>backend/src/app.controller.spec.ts (única prueba unitaria del backend)</w:t>
-            </w:r>
-          </w:p>
-        </w:tc>
-      </w:tr>
-      <w:tr>
-        <w:tc>
-          <w:tcPr>
-            <w:tcW w:type="dxa" w:w="1020"/>
-          </w:tcPr>
-          <w:p>
-            <w:r>
-              <w:t>NC-03</w:t>
-            </w:r>
-          </w:p>
-        </w:tc>
-        <w:tc>
-          <w:tcPr>
-            <w:tcW w:type="dxa" w:w="7370"/>
-          </w:tcPr>
-          <w:p>
-            <w:r>
-              <w:t>El LocationProvider real no está conectado a sensores del dispositivo, por lo que el escenario EC-03 no tiene línea base medida.</w:t>
-            </w:r>
-          </w:p>
-        </w:tc>
-        <w:tc>
-          <w:tcPr>
-            <w:tcW w:type="dxa" w:w="5783"/>
-          </w:tcPr>
-          <w:p>
-            <w:r>
-              <w:t>backend/src/modules/ubicacion/infrastructure/platform/location-adapter.ts; correcciones.md, criterio 4</w:t>
-            </w:r>
-          </w:p>
-        </w:tc>
-      </w:tr>
-      <w:tr>
-        <w:tc>
-          <w:tcPr>
-            <w:tcW w:type="dxa" w:w="1020"/>
-          </w:tcPr>
-          <w:p>
-            <w:r>
-              <w:t>NC-04</w:t>
-            </w:r>
-          </w:p>
-        </w:tc>
-        <w:tc>
-          <w:tcPr>
-            <w:tcW w:type="dxa" w:w="7370"/>
-          </w:tcPr>
-          <w:p>
-            <w:r>
-              <w:t>Las rutas REST reales no coinciden con las documentadas: el código expone /api/v1/map/buildings y la documentación describe /api/mapas/edificios/:id.</w:t>
-            </w:r>
-          </w:p>
-        </w:tc>
-        <w:tc>
-          <w:tcPr>
-            <w:tcW w:type="dxa" w:w="5783"/>
-          </w:tcPr>
-          <w:p>
-            <w:r>
-              <w:t>backend/src/modules/mapas/interfaces/mapas.controller.ts vs docs/arc42/arc42-template-EN.md (sección 6) y docs/c4/C4_L2_Container.md</w:t>
-            </w:r>
-          </w:p>
-        </w:tc>
-      </w:tr>
-      <w:tr>
-        <w:tc>
-          <w:tcPr>
-            <w:tcW w:type="dxa" w:w="1020"/>
-          </w:tcPr>
-          <w:p>
-            <w:r>
-              <w:t>NC-05</w:t>
-            </w:r>
-          </w:p>
-        </w:tc>
-        <w:tc>
-          <w:tcPr>
-            <w:tcW w:type="dxa" w:w="7370"/>
-          </w:tcPr>
-          <w:p>
-            <w:r>
-              <w:t>El adaptador de render 3D (MapRenderer) no está implementado, por lo que los escenarios EC-01 y EC-02 no tienen medición real.</w:t>
-            </w:r>
-          </w:p>
-        </w:tc>
-        <w:tc>
-          <w:tcPr>
-            <w:tcW w:type="dxa" w:w="5783"/>
-          </w:tcPr>
-          <w:p>
-            <w:r>
-              <w:t>docs/adr/0002-restriccion-rendimiento-compatibilidad-dispositivos.md; correcciones.md, criterio 4</w:t>
-            </w:r>
-          </w:p>
-        </w:tc>
-      </w:tr>
-      <w:tr>
-        <w:tc>
-          <w:tcPr>
-            <w:tcW w:type="dxa" w:w="1020"/>
-          </w:tcPr>
-          <w:p>
-            <w:r>
-              <w:t>NC-06</w:t>
-            </w:r>
-          </w:p>
-        </w:tc>
-        <w:tc>
-          <w:tcPr>
-            <w:tcW w:type="dxa" w:w="7370"/>
-          </w:tcPr>
-          <w:p>
-            <w:r>
-              <w:t>El módulo pois del frontend está incompleto: solo tiene domain/entities.dart y el barrel pois_feature.dart; los directorios application/, infrastructure/ y presentation/ existen pero están vacíos.</w:t>
-            </w:r>
-          </w:p>
-        </w:tc>
-        <w:tc>
-          <w:tcPr>
-            <w:tcW w:type="dxa" w:w="5783"/>
-          </w:tcPr>
-          <w:p>
-            <w:r>
-              <w:t>frontend/lib/features/pois/ (application/, infrastructure/, presentation/ sin archivos versionados)</w:t>
-            </w:r>
-          </w:p>
-        </w:tc>
-      </w:tr>
-      <w:tr>
-        <w:tc>
-          <w:tcPr>
-            <w:tcW w:type="dxa" w:w="1020"/>
-          </w:tcPr>
-          <w:p>
-            <w:r>
-              <w:t>NC-07</w:t>
-            </w:r>
-          </w:p>
-        </w:tc>
-        <w:tc>
-          <w:tcPr>
-            <w:tcW w:type="dxa" w:w="7370"/>
-          </w:tcPr>
-          <w:p>
-            <w:r>
-              <w:t>El módulo campus existe en el código con datos de prueba (mock) y es la pantalla principal real de la app, pero no aparece documentado en arc42, C4, README ni docs/aspectos.md.</w:t>
-            </w:r>
-          </w:p>
-        </w:tc>
-        <w:tc>
-          <w:tcPr>
-            <w:tcW w:type="dxa" w:w="5783"/>
-          </w:tcPr>
-          <w:p>
-            <w:r>
-              <w:t>frontend/lib/features/campus/data/mock_places.dart</w:t>
-            </w:r>
-          </w:p>
-        </w:tc>
-      </w:tr>
-      <w:tr>
-        <w:tc>
-          <w:tcPr>
-            <w:tcW w:type="dxa" w:w="1020"/>
-          </w:tcPr>
-          <w:p>
-            <w:r>
-              <w:t>NC-08</w:t>
-            </w:r>
-          </w:p>
-        </w:tc>
-        <w:tc>
-          <w:tcPr>
-            <w:tcW w:type="dxa" w:w="7370"/>
-          </w:tcPr>
-          <w:p>
-            <w:r>
-              <w:t>No existen pruebas de widget ni unitarias por feature en Flutter; solo hay una prueba de plantilla sin actualizar.</w:t>
-            </w:r>
-          </w:p>
-        </w:tc>
-        <w:tc>
-          <w:tcPr>
-            <w:tcW w:type="dxa" w:w="5783"/>
-          </w:tcPr>
-          <w:p>
-            <w:r>
-              <w:t>frontend/test/widget_test.dart (única prueba del frontend)</w:t>
-            </w:r>
-          </w:p>
-        </w:tc>
-      </w:tr>
-      <w:tr>
-        <w:tc>
-          <w:tcPr>
-            <w:tcW w:type="dxa" w:w="1020"/>
-          </w:tcPr>
-          <w:p>
-            <w:r>
-              <w:t>NC-09</w:t>
-            </w:r>
-          </w:p>
-        </w:tc>
-        <w:tc>
-          <w:tcPr>
-            <w:tcW w:type="dxa" w:w="7370"/>
-          </w:tcPr>
-          <w:p>
-            <w:r>
-              <w:t>La política de caché offline de modelos 3D no tiene evidencia de verificación, por lo que el escenario EC-04 no tiene resultado contrastado.</w:t>
-            </w:r>
-          </w:p>
-        </w:tc>
-        <w:tc>
-          <w:tcPr>
-            <w:tcW w:type="dxa" w:w="5783"/>
-          </w:tcPr>
-          <w:p>
-            <w:r>
-              <w:t>frontend/lib/features/mapas/infrastructure/storage/model_cache.dart; docs/aspectos.md (fila EC-04, columnas Pruebas/Evidencia en "pendiente")</w:t>
-            </w:r>
-          </w:p>
-        </w:tc>
-      </w:tr>
-      <w:tr>
-        <w:tc>
-          <w:tcPr>
-            <w:tcW w:type="dxa" w:w="1020"/>
-          </w:tcPr>
-          <w:p>
-            <w:r>
-              <w:t>NC-10</w:t>
-            </w:r>
-          </w:p>
-        </w:tc>
-        <w:tc>
-          <w:tcPr>
-            <w:tcW w:type="dxa" w:w="7370"/>
-          </w:tcPr>
-          <w:p>
-            <w:r>
-              <w:t>FLUTTER_VERSION="3.22.0" (Dart 3.4.x) del pipeline es incompatible con el SDK declarado en pubspec.yaml (^3.12.0) y con pubspec.lock (flutter &gt;=3.44.0); "flutter pub get" falla en CI.</w:t>
-            </w:r>
-          </w:p>
-        </w:tc>
-        <w:tc>
-          <w:tcPr>
-            <w:tcW w:type="dxa" w:w="5783"/>
-          </w:tcPr>
-          <w:p>
-            <w:r>
-              <w:t>.github/workflows/ci.yml:20; frontend/pubspec.yaml:8; frontend/pubspec.lock (sdks: flutter &gt;=3.44.0)</w:t>
-            </w:r>
-          </w:p>
-        </w:tc>
-      </w:tr>
-      <w:tr>
-        <w:tc>
-          <w:tcPr>
-            <w:tcW w:type="dxa" w:w="1020"/>
-          </w:tcPr>
-          <w:p>
-            <w:r>
-              <w:t>NC-11</w:t>
-            </w:r>
-          </w:p>
-        </w:tc>
-        <w:tc>
-          <w:tcPr>
-            <w:tcW w:type="dxa" w:w="7370"/>
-          </w:tcPr>
-          <w:p>
-            <w:r>
-              <w:t>El job quality-gate depende de backend, frontend y docs, y falla en cascada mientras NC-01 y NC-10 no se resuelvan.</w:t>
-            </w:r>
-          </w:p>
-        </w:tc>
-        <w:tc>
-          <w:tcPr>
-            <w:tcW w:type="dxa" w:w="5783"/>
-          </w:tcPr>
-          <w:p>
-            <w:r>
-              <w:t>.github/workflows/ci.yml:166</w:t>
-            </w:r>
-          </w:p>
-        </w:tc>
-      </w:tr>
-      <w:tr>
-        <w:tc>
-          <w:tcPr>
-            <w:tcW w:type="dxa" w:w="1020"/>
-          </w:tcPr>
-          <w:p>
-            <w:r>
-              <w:t>NC-12</w:t>
-            </w:r>
-          </w:p>
-        </w:tc>
-        <w:tc>
-          <w:tcPr>
-            <w:tcW w:type="dxa" w:w="7370"/>
-          </w:tcPr>
-          <w:p>
-            <w:r>
-              <w:t>Las columnas "Pruebas" y "Evidencia" de la matriz de trazabilidad están incompletas para los cuatro escenarios de calidad (EC-01 a EC-04).</w:t>
-            </w:r>
-          </w:p>
-        </w:tc>
-        <w:tc>
-          <w:tcPr>
-            <w:tcW w:type="dxa" w:w="5783"/>
-          </w:tcPr>
-          <w:p>
-            <w:r>
-              <w:t>docs/aspectos.md</w:t>
-            </w:r>
-          </w:p>
-        </w:tc>
-      </w:tr>
-    </w:tbl>
-    <w:p/>
-    <w:p>
-      <w:pPr>
-        <w:pStyle w:val="Heading2"/>
-      </w:pPr>
-      <w:r>
-        <w:t>3. Resumen de no conformidades por dueño</w:t>
-      </w:r>
-    </w:p>
-    <w:tbl>
-      <w:tblPr>
-        <w:tblStyle w:val="TableGrid"/>
-        <w:tblW w:type="auto" w:w="0"/>
-        <w:tblLayout w:type="fixed"/>
-        <w:tblLook w:firstColumn="1" w:firstRow="1" w:lastColumn="0" w:lastRow="0" w:noHBand="0" w:noVBand="1" w:val="04A0"/>
-      </w:tblPr>
-      <w:tblGrid>
-        <w:gridCol w:w="4713"/>
-        <w:gridCol w:w="4713"/>
-        <w:gridCol w:w="4713"/>
-      </w:tblGrid>
-      <w:tr>
-        <w:tc>
-          <w:tcPr>
-            <w:tcW w:type="dxa" w:w="3402"/>
-            <w:shd w:val="clear" w:color="auto" w:fill="1F4E78"/>
-          </w:tcPr>
-          <w:p>
-            <w:r>
-              <w:rPr>
-                <w:b/>
-                <w:color w:val="FFFFFF"/>
-              </w:rPr>
-              <w:t>Dueño único</w:t>
-            </w:r>
-          </w:p>
-        </w:tc>
-        <w:tc>
-          <w:tcPr>
-            <w:tcW w:type="dxa" w:w="5669"/>
-            <w:shd w:val="clear" w:color="auto" w:fill="1F4E78"/>
-          </w:tcPr>
-          <w:p>
-            <w:r>
-              <w:rPr>
-                <w:b/>
-                <w:color w:val="FFFFFF"/>
-              </w:rPr>
-              <w:t>Módulos a cargo</w:t>
+              <w:t>Angel Fabian Gutierrez Gomez</w:t>
             </w:r>
           </w:p>
         </w:tc>
         <w:tc>
           <w:tcPr>
             <w:tcW w:type="dxa" w:w="5102"/>
-            <w:shd w:val="clear" w:color="auto" w:fill="1F4E78"/>
           </w:tcPr>
           <w:p>
             <w:r>
-              <w:rPr>
-                <w:b/>
-                <w:color w:val="FFFFFF"/>
-              </w:rPr>
-              <w:t>No conformidades abiertas</w:t>
+              <w:t>infraestructura/CI-CD, configuración de plataforma (Android/Web)</w:t>
+            </w:r>
+          </w:p>
+        </w:tc>
+        <w:tc>
+          <w:tcPr>
+            <w:tcW w:type="dxa" w:w="4535"/>
+          </w:tcPr>
+          <w:p>
+            <w:r>
+              <w:t>H-01, H-02, H-03, H-04, H-05, H-06, H-07, H-08, H-10</w:t>
+            </w:r>
+          </w:p>
+        </w:tc>
+        <w:tc>
+          <w:tcPr>
+            <w:tcW w:type="dxa" w:w="2551"/>
+          </w:tcPr>
+          <w:p>
+            <w:r>
+              <w:t>H-09</w:t>
             </w:r>
           </w:p>
         </w:tc>
@@ -1638,21 +1315,31 @@
         </w:tc>
         <w:tc>
           <w:tcPr>
-            <w:tcW w:type="dxa" w:w="5669"/>
+            <w:tcW w:type="dxa" w:w="5102"/>
           </w:tcPr>
           <w:p>
             <w:r>
-              <w:t>mapas (back/front), pois (back), campus (front)</w:t>
+              <w:t>Ninguno en este corte</w:t>
             </w:r>
           </w:p>
         </w:tc>
         <w:tc>
           <w:tcPr>
-            <w:tcW w:type="dxa" w:w="5102"/>
+            <w:tcW w:type="dxa" w:w="4535"/>
           </w:tcPr>
           <w:p>
             <w:r>
-              <w:t>NC-01, NC-02, NC-04, NC-05, NC-06, NC-07, NC-08, NC-09</w:t>
+              <w:t>—</w:t>
+            </w:r>
+          </w:p>
+        </w:tc>
+        <w:tc>
+          <w:tcPr>
+            <w:tcW w:type="dxa" w:w="2551"/>
+          </w:tcPr>
+          <w:p>
+            <w:r>
+              <w:t>—</w:t>
             </w:r>
           </w:p>
         </w:tc>
@@ -1670,61 +1357,645 @@
         </w:tc>
         <w:tc>
           <w:tcPr>
-            <w:tcW w:type="dxa" w:w="5669"/>
+            <w:tcW w:type="dxa" w:w="5102"/>
           </w:tcPr>
           <w:p>
             <w:r>
-              <w:t>auth (back/front), ubicacion (back/front)</w:t>
+              <w:t>Ninguno en este corte</w:t>
             </w:r>
           </w:p>
         </w:tc>
         <w:tc>
           <w:tcPr>
-            <w:tcW w:type="dxa" w:w="5102"/>
+            <w:tcW w:type="dxa" w:w="4535"/>
           </w:tcPr>
           <w:p>
             <w:r>
-              <w:t>NC-01, NC-02, NC-03, NC-08</w:t>
-            </w:r>
-          </w:p>
-        </w:tc>
-      </w:tr>
-      <w:tr>
-        <w:tc>
-          <w:tcPr>
-            <w:tcW w:type="dxa" w:w="3402"/>
-          </w:tcPr>
-          <w:p>
-            <w:r>
-              <w:t>Angel Fabian Gutierrez Gomez</w:t>
+              <w:t>—</w:t>
             </w:r>
           </w:p>
         </w:tc>
         <w:tc>
           <w:tcPr>
-            <w:tcW w:type="dxa" w:w="5669"/>
+            <w:tcW w:type="dxa" w:w="2551"/>
           </w:tcPr>
           <w:p>
             <w:r>
-              <w:t>shared/core (back/front), infraestructura/CI-CD, documentación</w:t>
-            </w:r>
-          </w:p>
-        </w:tc>
-        <w:tc>
-          <w:tcPr>
-            <w:tcW w:type="dxa" w:w="5102"/>
-          </w:tcPr>
-          <w:p>
-            <w:r>
-              <w:t>NC-02, NC-04, NC-07, NC-08, NC-10, NC-11, NC-12</w:t>
+              <w:t>—</w:t>
             </w:r>
           </w:p>
         </w:tc>
       </w:tr>
     </w:tbl>
+    <w:p>
+      <w:r>
+        <w:br w:type="page"/>
+      </w:r>
+    </w:p>
+    <w:p>
+      <w:pPr>
+        <w:pStyle w:val="Heading2"/>
+      </w:pPr>
+      <w:r>
+        <w:t>3. Catálogo de hallazgos del panel de análisis estático</w:t>
+      </w:r>
+    </w:p>
+    <w:p>
+      <w:r>
+        <w:t>Fuente: panel de análisis estático de seguridad ("Security snapshot") y confiabilidad ("Reliability snapshot") del repositorio, consultado el 13 de septiembre de 2026. La antigüedad relativa reportada por el panel para cada hallazgo ("13 días", "22 días") se conserva como referencia; todos los hallazgos seguían abiertos y sin asignar al momento de esta revisión.</w:t>
+      </w:r>
+    </w:p>
+    <w:p>
+      <w:pPr>
+        <w:pStyle w:val="Heading3"/>
+      </w:pPr>
+      <w:r>
+        <w:t>3.1 Seguridad — Severidad Alta</w:t>
+      </w:r>
+    </w:p>
+    <w:p>
+      <w:r>
+        <w:rPr>
+          <w:b/>
+          <w:color w:val="000000"/>
+          <w:sz w:val="22"/>
+        </w:rPr>
+        <w:t>H-01 — .github/workflows/ci.yml (L90)</w:t>
+      </w:r>
+    </w:p>
+    <w:p>
+      <w:r>
+        <w:rPr>
+          <w:b/>
+        </w:rPr>
+        <w:t xml:space="preserve">Severidad: </w:t>
+      </w:r>
+      <w:r>
+        <w:t>Alta (Seguridad)</w:t>
+      </w:r>
+      <w:r>
+        <w:t xml:space="preserve">    </w:t>
+      </w:r>
+      <w:r>
+        <w:rPr>
+          <w:b/>
+        </w:rPr>
+        <w:t xml:space="preserve">Esfuerzo estimado: </w:t>
+      </w:r>
+      <w:r>
+        <w:t>30 min</w:t>
+      </w:r>
+    </w:p>
+    <w:p>
+      <w:r>
+        <w:rPr>
+          <w:b/>
+        </w:rPr>
+        <w:t xml:space="preserve">Descripción: </w:t>
+      </w:r>
+      <w:r>
+        <w:t>La acción `subosito/flutter-action@v2` se referencia por un tag mutable en lugar de un hash de commit SHA completo. Un tag puede ser reapuntado por el mantenedor (o por un tercero, si su cuenta es comprometida) a un commit distinto sin que el pipeline lo note.</w:t>
+      </w:r>
+    </w:p>
+    <w:p>
+      <w:r>
+        <w:rPr>
+          <w:b/>
+        </w:rPr>
+        <w:t xml:space="preserve">Plan de corrección: </w:t>
+      </w:r>
+      <w:r>
+        <w:t>Sustituir "@v2" por el hash de commit SHA-1 completo correspondiente a la versión en uso (formato "subosito/flutter-action@&lt;sha-completo&gt; # v2.x.x"), y agregar `.github/dependabot.yml` con el ecosistema "github-actions" para recibir actualizaciones automáticas del hash cuando se publiquen nuevas versiones firmadas.</w:t>
+      </w:r>
+    </w:p>
+    <w:p/>
+    <w:p>
+      <w:r>
+        <w:rPr>
+          <w:b/>
+          <w:color w:val="000000"/>
+          <w:sz w:val="22"/>
+        </w:rPr>
+        <w:t>H-02 — .github/workflows/ci.yml (L134)</w:t>
+      </w:r>
+    </w:p>
+    <w:p>
+      <w:r>
+        <w:rPr>
+          <w:b/>
+        </w:rPr>
+        <w:t xml:space="preserve">Severidad: </w:t>
+      </w:r>
+      <w:r>
+        <w:t>Alta (Seguridad)</w:t>
+      </w:r>
+      <w:r>
+        <w:t xml:space="preserve">    </w:t>
+      </w:r>
+      <w:r>
+        <w:rPr>
+          <w:b/>
+        </w:rPr>
+        <w:t xml:space="preserve">Esfuerzo estimado: </w:t>
+      </w:r>
+      <w:r>
+        <w:t>30 min</w:t>
+      </w:r>
+    </w:p>
+    <w:p>
+      <w:r>
+        <w:rPr>
+          <w:b/>
+        </w:rPr>
+        <w:t xml:space="preserve">Descripción: </w:t>
+      </w:r>
+      <w:r>
+        <w:t>La acción `lycheeverse/lychee-action@v2` se referencia por un tag mutable en lugar de un hash de commit SHA completo, con el mismo riesgo de cadena de suministro que H-01.</w:t>
+      </w:r>
+    </w:p>
+    <w:p>
+      <w:r>
+        <w:rPr>
+          <w:b/>
+        </w:rPr>
+        <w:t xml:space="preserve">Plan de corrección: </w:t>
+      </w:r>
+      <w:r>
+        <w:t>Aplicar la misma corrección que H-01: fijar el hash de commit SHA completo de `lychee-action` e incluirlo en la configuración de Dependabot para acciones de GitHub.</w:t>
+      </w:r>
+    </w:p>
+    <w:p/>
+    <w:p>
+      <w:r>
+        <w:rPr>
+          <w:b/>
+          <w:color w:val="000000"/>
+          <w:sz w:val="22"/>
+        </w:rPr>
+        <w:t>H-03 — frontend/android/app/build.gradle.kts (L29)</w:t>
+      </w:r>
+    </w:p>
+    <w:p>
+      <w:r>
+        <w:rPr>
+          <w:b/>
+        </w:rPr>
+        <w:t xml:space="preserve">Severidad: </w:t>
+      </w:r>
+      <w:r>
+        <w:t>Alta (Seguridad)</w:t>
+      </w:r>
+      <w:r>
+        <w:t xml:space="preserve">    </w:t>
+      </w:r>
+      <w:r>
+        <w:rPr>
+          <w:b/>
+        </w:rPr>
+        <w:t xml:space="preserve">Esfuerzo estimado: </w:t>
+      </w:r>
+      <w:r>
+        <w:t>5 min (banderas) + trabajo adicional de firma, fuera del alcance de este corte</w:t>
+      </w:r>
+    </w:p>
+    <w:p>
+      <w:r>
+        <w:rPr>
+          <w:b/>
+        </w:rPr>
+        <w:t xml:space="preserve">Descripción: </w:t>
+      </w:r>
+      <w:r>
+        <w:t>El bloque `release { }` no habilita ofuscación ni reducción de código (`isMinifyEnabled` / `isShrinkResources`), por lo que un APK/AAB de release se distribuiría con el bytecode Kotlin/Java legible y sin eliminar código muerto. Además, ese mismo bloque firma el release con `signingConfigs.getByName("debug")`, la configuración de firma de depuración.</w:t>
+      </w:r>
+    </w:p>
+    <w:p>
+      <w:r>
+        <w:rPr>
+          <w:b/>
+        </w:rPr>
+        <w:t xml:space="preserve">Plan de corrección: </w:t>
+      </w:r>
+      <w:r>
+        <w:t>Habilitar `isMinifyEnabled = true` e `isShrinkResources = true` dentro de `release { }`, declarar un `proguard-rules.pro` con las reglas de conservación necesarias para Flutter y el SDK de Supabase, y sustituir la firma de depuración por una configuración de firma de release real (keystore fuera del control de versiones, inyectado por variables de entorno en CI) antes de publicar la aplicación.</w:t>
+      </w:r>
+    </w:p>
+    <w:p/>
+    <w:p>
+      <w:pPr>
+        <w:pStyle w:val="Heading3"/>
+      </w:pPr>
+      <w:r>
+        <w:t>3.2 Seguridad — Severidad Media</w:t>
+      </w:r>
+    </w:p>
+    <w:p>
+      <w:r>
+        <w:rPr>
+          <w:b/>
+          <w:color w:val="000000"/>
+          <w:sz w:val="22"/>
+        </w:rPr>
+        <w:t>H-04 — .github/workflows/ci.yml (L44)</w:t>
+      </w:r>
+    </w:p>
+    <w:p>
+      <w:r>
+        <w:rPr>
+          <w:b/>
+        </w:rPr>
+        <w:t xml:space="preserve">Severidad: </w:t>
+      </w:r>
+      <w:r>
+        <w:t>Media (Seguridad)</w:t>
+      </w:r>
+      <w:r>
+        <w:t xml:space="preserve">    </w:t>
+      </w:r>
+      <w:r>
+        <w:rPr>
+          <w:b/>
+        </w:rPr>
+        <w:t xml:space="preserve">Esfuerzo estimado: </w:t>
+      </w:r>
+      <w:r>
+        <w:t>30 min</w:t>
+      </w:r>
+    </w:p>
+    <w:p>
+      <w:r>
+        <w:rPr>
+          <w:b/>
+        </w:rPr>
+        <w:t xml:space="preserve">Descripción: </w:t>
+      </w:r>
+      <w:r>
+        <w:t>El paso `npm ci` del job backend no incluye `--ignore-scripts`, por lo que cualquier dependencia (directa o transitiva) puede ejecutar scripts de ciclo de vida (`preinstall`/`postinstall`) arbitrarios durante la instalación en el runner de CI.</w:t>
+      </w:r>
+    </w:p>
+    <w:p>
+      <w:r>
+        <w:rPr>
+          <w:b/>
+        </w:rPr>
+        <w:t xml:space="preserve">Plan de corrección: </w:t>
+      </w:r>
+      <w:r>
+        <w:t>Cambiar el paso a `npm ci --ignore-scripts`. Se verificó `backend/package.json`: no declara scripts `prepare` ni `postinstall` propios y ninguna dependencia de producción requiere compilación nativa (no hay paquetes tipo bcrypt/sharp), por lo que el cambio no debería romper el build. Si en el futuro una dependencia nueva requiere un script de instalación, debe permitirse de forma explícita (por ejemplo, `npm rebuild &lt;paquete&gt;` en un paso posterior) en vez de desactivar la bandera de forma global.</w:t>
+      </w:r>
+    </w:p>
+    <w:p/>
+    <w:p>
+      <w:r>
+        <w:rPr>
+          <w:b/>
+          <w:color w:val="000000"/>
+          <w:sz w:val="22"/>
+        </w:rPr>
+        <w:t>H-05 — .github/workflows/ci.yml (L100)</w:t>
+      </w:r>
+    </w:p>
+    <w:p>
+      <w:r>
+        <w:rPr>
+          <w:b/>
+        </w:rPr>
+        <w:t xml:space="preserve">Severidad: </w:t>
+      </w:r>
+      <w:r>
+        <w:t>Media (Seguridad)</w:t>
+      </w:r>
+      <w:r>
+        <w:t xml:space="preserve">    </w:t>
+      </w:r>
+      <w:r>
+        <w:rPr>
+          <w:b/>
+        </w:rPr>
+        <w:t xml:space="preserve">Esfuerzo estimado: </w:t>
+      </w:r>
+      <w:r>
+        <w:t>1 h</w:t>
+      </w:r>
+    </w:p>
+    <w:p>
+      <w:r>
+        <w:rPr>
+          <w:b/>
+        </w:rPr>
+        <w:t xml:space="preserve">Descripción: </w:t>
+      </w:r>
+      <w:r>
+        <w:t>El paso `flutter pub get` del job frontend no fuerza el uso estricto del lockfile. Aunque `frontend/pubspec.lock` está versionado en el repositorio, el comando tal como está permite que la resolución de dependencias se desvíe del lockfile de forma silenciosa si `pubspec.yaml` cambia sin que el lockfile se actualice a la par.</w:t>
+      </w:r>
+    </w:p>
+    <w:p>
+      <w:r>
+        <w:rPr>
+          <w:b/>
+        </w:rPr>
+        <w:t xml:space="preserve">Plan de corrección: </w:t>
+      </w:r>
+      <w:r>
+        <w:t>Cambiar el paso a `flutter pub get --enforce-lockfile`, de forma que el pipeline falle explícitamente si la resolución de dependencias difiere de `pubspec.lock`, en lugar de aceptar el desvío sin avisar.</w:t>
+      </w:r>
+    </w:p>
+    <w:p/>
+    <w:p>
+      <w:r>
+        <w:rPr>
+          <w:b/>
+          <w:color w:val="000000"/>
+          <w:sz w:val="22"/>
+        </w:rPr>
+        <w:t>H-06 — frontend/android/app/src/main/AndroidManifest.xml (L2)</w:t>
+      </w:r>
+    </w:p>
+    <w:p>
+      <w:r>
+        <w:rPr>
+          <w:b/>
+        </w:rPr>
+        <w:t xml:space="preserve">Severidad: </w:t>
+      </w:r>
+      <w:r>
+        <w:t>Media (Seguridad)</w:t>
+      </w:r>
+      <w:r>
+        <w:t xml:space="preserve">    </w:t>
+      </w:r>
+      <w:r>
+        <w:rPr>
+          <w:b/>
+        </w:rPr>
+        <w:t xml:space="preserve">Esfuerzo estimado: </w:t>
+      </w:r>
+      <w:r>
+        <w:t>1 h 30 min</w:t>
+      </w:r>
+    </w:p>
+    <w:p>
+      <w:r>
+        <w:rPr>
+          <w:b/>
+        </w:rPr>
+        <w:t xml:space="preserve">Descripción: </w:t>
+      </w:r>
+      <w:r>
+        <w:t>El elemento `&lt;application&gt;` no declara `android:allowBackup`, por lo que Android asume `true` de forma implícita: los datos de la app (incluida la caja de almacenamiento seguro de tokens de sesión, `frontend/lib/core/storage/secure_storage.dart`) podrían incluirse en la copia de seguridad automática del dispositivo y replicarse a la cuenta de Google del usuario.</w:t>
+      </w:r>
+    </w:p>
+    <w:p>
+      <w:r>
+        <w:rPr>
+          <w:b/>
+        </w:rPr>
+        <w:t xml:space="preserve">Plan de corrección: </w:t>
+      </w:r>
+      <w:r>
+        <w:t>Declarar explícitamente `android:allowBackup="false"` en `&lt;application&gt;`. La caché local de mapas (Hive/Filesystem) es recreable desde el backend, por lo que no se pierde información valiosa al excluirla del backup; si más adelante se requiere backup selectivo, usar `android:dataExtractionRules` (Android 12+) para excluir explícitamente el almacenamiento seguro.</w:t>
+      </w:r>
+    </w:p>
+    <w:p/>
+    <w:p>
+      <w:r>
+        <w:rPr>
+          <w:b/>
+          <w:color w:val="000000"/>
+          <w:sz w:val="22"/>
+        </w:rPr>
+        <w:t>H-07 — frontend/android/build.gradle.kts</w:t>
+      </w:r>
+    </w:p>
+    <w:p>
+      <w:r>
+        <w:rPr>
+          <w:b/>
+        </w:rPr>
+        <w:t xml:space="preserve">Severidad: </w:t>
+      </w:r>
+      <w:r>
+        <w:t>Media (Seguridad)</w:t>
+      </w:r>
+      <w:r>
+        <w:t xml:space="preserve">    </w:t>
+      </w:r>
+      <w:r>
+        <w:rPr>
+          <w:b/>
+        </w:rPr>
+        <w:t xml:space="preserve">Esfuerzo estimado: </w:t>
+      </w:r>
+      <w:r>
+        <w:t>5 min</w:t>
+      </w:r>
+    </w:p>
+    <w:p>
+      <w:r>
+        <w:rPr>
+          <w:b/>
+        </w:rPr>
+        <w:t xml:space="preserve">Descripción: </w:t>
+      </w:r>
+      <w:r>
+        <w:t>El proyecto Android no tiene archivo de bloqueo de dependencias Gradle (`gradle.lockfile` o `gradle/verification-metadata.xml`), por lo que las versiones resueltas de las dependencias nativas no son reproducibles ni verificables entre builds.</w:t>
+      </w:r>
+    </w:p>
+    <w:p>
+      <w:r>
+        <w:rPr>
+          <w:b/>
+        </w:rPr>
+        <w:t xml:space="preserve">Plan de corrección: </w:t>
+      </w:r>
+      <w:r>
+        <w:t>Habilitar `dependencyLocking { lockAllConfigurations() }` en `frontend/android/build.gradle.kts`, generar el archivo de bloqueo con `./gradlew :app:dependencies --write-locks` y versionarlo, replicando para Gradle la misma práctica que ya existe con `pubspec.lock` (Dart) y `package-lock.json` (Node).</w:t>
+      </w:r>
+    </w:p>
+    <w:p/>
+    <w:p>
+      <w:pPr>
+        <w:pStyle w:val="Heading3"/>
+      </w:pPr>
+      <w:r>
+        <w:t>3.3 Seguridad — Severidad Baja</w:t>
+      </w:r>
+    </w:p>
+    <w:p>
+      <w:r>
+        <w:rPr>
+          <w:b/>
+          <w:color w:val="000000"/>
+          <w:sz w:val="22"/>
+        </w:rPr>
+        <w:t>H-08 — frontend/android/app/src/main/AndroidManifest.xml (L2)</w:t>
+      </w:r>
+    </w:p>
+    <w:p>
+      <w:r>
+        <w:rPr>
+          <w:b/>
+        </w:rPr>
+        <w:t xml:space="preserve">Severidad: </w:t>
+      </w:r>
+      <w:r>
+        <w:t>Baja (Seguridad)</w:t>
+      </w:r>
+      <w:r>
+        <w:t xml:space="preserve">    </w:t>
+      </w:r>
+      <w:r>
+        <w:rPr>
+          <w:b/>
+        </w:rPr>
+        <w:t xml:space="preserve">Esfuerzo estimado: </w:t>
+      </w:r>
+      <w:r>
+        <w:t>30 min</w:t>
+      </w:r>
+    </w:p>
+    <w:p>
+      <w:r>
+        <w:rPr>
+          <w:b/>
+        </w:rPr>
+        <w:t xml:space="preserve">Descripción: </w:t>
+      </w:r>
+      <w:r>
+        <w:t>El elemento `&lt;application&gt;` no declara `android:usesCleartextTraffic`, por lo que en versiones de Android anteriores a la 9 (API 28) el tráfico HTTP sin cifrar queda implícitamente permitido. Este riesgo es real y no solo teórico: `frontend/lib/core/network/dio_client.dart` define `http://localhost:3000/api` como URL base por defecto (`String.fromEnvironment('API_BASE_URL', defaultValue: ...)`) y el paso "Build web" de `ci.yml` no sobreescribe `API_BASE_URL`, por lo que un build sin ese parámetro explícito queda apuntando a una URL en texto plano.</w:t>
+      </w:r>
+    </w:p>
+    <w:p>
+      <w:r>
+        <w:rPr>
+          <w:b/>
+        </w:rPr>
+        <w:t xml:space="preserve">Plan de corrección: </w:t>
+      </w:r>
+      <w:r>
+        <w:t>Declarar explícitamente `android:usesCleartextTraffic="false"` en `&lt;application&gt;`, y fijar `API_BASE_URL` a una URL HTTPS de forma obligatoria en cualquier build de release (variable de entorno requerida en CI, sin valor por defecto en texto plano para ese flujo).</w:t>
+      </w:r>
+    </w:p>
+    <w:p/>
+    <w:p>
+      <w:pPr>
+        <w:pStyle w:val="Heading3"/>
+      </w:pPr>
+      <w:r>
+        <w:t>3.4 Confiabilidad — Severidad Alta</w:t>
+      </w:r>
+    </w:p>
+    <w:p>
+      <w:r>
+        <w:rPr>
+          <w:b/>
+          <w:color w:val="000000"/>
+          <w:sz w:val="22"/>
+        </w:rPr>
+        <w:t>H-09 — scripts/dev.sh (L21, L26, L32, L64)</w:t>
+      </w:r>
+    </w:p>
+    <w:p>
+      <w:r>
+        <w:rPr>
+          <w:b/>
+        </w:rPr>
+        <w:t xml:space="preserve">Severidad: </w:t>
+      </w:r>
+      <w:r>
+        <w:t>Alta (Confiabilidad)</w:t>
+      </w:r>
+    </w:p>
+    <w:p>
+      <w:r>
+        <w:rPr>
+          <w:b/>
+        </w:rPr>
+        <w:t xml:space="preserve">Descripción: </w:t>
+      </w:r>
+      <w:r>
+        <w:t>El panel señala cuatro condicionales que usan `[ ]` (test POSIX) en lugar de `[[ ]]` (test extendido de Bash), calificando `[[ ]]` como "más seguro y con más funciones".</w:t>
+      </w:r>
+    </w:p>
+    <w:p>
+      <w:r>
+        <w:rPr>
+          <w:b/>
+        </w:rPr>
+        <w:t xml:space="preserve">Justificación (falso positivo): </w:t>
+      </w:r>
+      <w:r>
+        <w:t>Se revisaron las cuatro líneas: las cuatro variables evaluadas están siempre entre comillas dobles (`"$BACKEND_DIR"`, `"$FRONTEND_DIR"`, `"$BACKEND_DIR/.env"`) o son el contador numérico `$i` de un bucle `for i in {1..10}`, que nunca contiene espacios ni caracteres especiales. Ninguna de las cuatro usa coincidencia de patrones, comparaciones de cadenas con operadores extendidos, ni expresiones compuestas dentro del corchete — que son los escenarios donde `[` puede comportarse de forma insegura frente a `[[`. Además, `scripts/dev.sh` es un script de conveniencia para levantar el entorno de desarrollo local; no se ejecuta en el pipeline de CI ni en ningún build de producción. Se registra como recomendación de estilo/consistencia sin un escenario de falla concreto en este archivo; puede homogeneizarse a `[[ ]]` en una limpieza menor futura, sin que ello corrija un defecto real hoy.</w:t>
+      </w:r>
+    </w:p>
+    <w:p/>
+    <w:p>
+      <w:pPr>
+        <w:pStyle w:val="Heading3"/>
+      </w:pPr>
+      <w:r>
+        <w:t>3.5 Confiabilidad — Severidad Media</w:t>
+      </w:r>
+    </w:p>
+    <w:p>
+      <w:r>
+        <w:rPr>
+          <w:b/>
+          <w:color w:val="000000"/>
+          <w:sz w:val="22"/>
+        </w:rPr>
+        <w:t>H-10 — frontend/web/index.html (L1)</w:t>
+      </w:r>
+    </w:p>
+    <w:p>
+      <w:r>
+        <w:rPr>
+          <w:b/>
+        </w:rPr>
+        <w:t xml:space="preserve">Severidad: </w:t>
+      </w:r>
+      <w:r>
+        <w:t>Media (Confiabilidad)</w:t>
+      </w:r>
+      <w:r>
+        <w:t xml:space="preserve">    </w:t>
+      </w:r>
+      <w:r>
+        <w:rPr>
+          <w:b/>
+        </w:rPr>
+        <w:t xml:space="preserve">Esfuerzo estimado: </w:t>
+      </w:r>
+      <w:r>
+        <w:t>2 min</w:t>
+      </w:r>
+    </w:p>
+    <w:p>
+      <w:r>
+        <w:rPr>
+          <w:b/>
+        </w:rPr>
+        <w:t xml:space="preserve">Descripción: </w:t>
+      </w:r>
+      <w:r>
+        <w:t>El elemento `&lt;html&gt;` no declara el atributo `lang` (ni `xml:lang`), lo que incumple el criterio de accesibilidad WCAG 2.1 3.1.1 ("Idioma de la página") para el build web que genera el job frontend del pipeline.</w:t>
+      </w:r>
+    </w:p>
+    <w:p>
+      <w:r>
+        <w:rPr>
+          <w:b/>
+        </w:rPr>
+        <w:t xml:space="preserve">Plan de corrección: </w:t>
+      </w:r>
+      <w:r>
+        <w:t>Agregar `lang="es"` al elemento `&lt;html&gt;` de `frontend/web/index.html`, en línea con el idioma por defecto de la aplicación (`frontend/lib/l10n/app_es.arb`), que además ofrece soporte para inglés (`app_en.arb`).</w:t>
+      </w:r>
+    </w:p>
+    <w:p/>
     <w:sectPr>
       <w:pgSz w:w="15840" w:h="12240" w:orient="landscape"/>
-      <w:pgMar w:top="850" w:right="850" w:bottom="850" w:left="850" w:header="720" w:footer="720" w:gutter="0"/>
+      <w:pgMar w:top="1020" w:right="1020" w:bottom="1020" w:left="1020" w:header="720" w:footer="720" w:gutter="0"/>
       <w:cols w:space="720"/>
       <w:docGrid w:linePitch="360"/>
     </w:sectPr>
@@ -2097,7 +2368,8 @@
     <w:rsid w:val="00FC693F"/>
     <w:rPr>
       <w:rFonts w:ascii="Calibri" w:hAnsi="Calibri"/>
-      <w:sz w:val="20"/>
+      <w:color w:val="000000"/>
+      <w:sz w:val="21"/>
     </w:rPr>
   </w:style>
   <w:style w:type="paragraph" w:styleId="Header">
@@ -2159,10 +2431,10 @@
       <w:outlineLvl w:val="0"/>
     </w:pPr>
     <w:rPr>
-      <w:rFonts w:asciiTheme="majorHAnsi" w:eastAsiaTheme="majorEastAsia" w:hAnsiTheme="majorHAnsi" w:cstheme="majorBidi"/>
+      <w:rFonts w:asciiTheme="majorHAnsi" w:eastAsiaTheme="majorEastAsia" w:hAnsiTheme="majorHAnsi" w:cstheme="majorBidi" w:ascii="Calibri" w:hAnsi="Calibri"/>
       <w:b/>
       <w:bCs/>
-      <w:color w:val="365F91" w:themeColor="accent1" w:themeShade="BF"/>
+      <w:color w:val="000000"/>
       <w:sz w:val="28"/>
       <w:szCs w:val="28"/>
     </w:rPr>
@@ -2183,10 +2455,10 @@
       <w:outlineLvl w:val="1"/>
     </w:pPr>
     <w:rPr>
-      <w:rFonts w:asciiTheme="majorHAnsi" w:eastAsiaTheme="majorEastAsia" w:hAnsiTheme="majorHAnsi" w:cstheme="majorBidi"/>
+      <w:rFonts w:asciiTheme="majorHAnsi" w:eastAsiaTheme="majorEastAsia" w:hAnsiTheme="majorHAnsi" w:cstheme="majorBidi" w:ascii="Calibri" w:hAnsi="Calibri"/>
       <w:b/>
       <w:bCs/>
-      <w:color w:val="4F81BD" w:themeColor="accent1"/>
+      <w:color w:val="000000"/>
       <w:sz w:val="26"/>
       <w:szCs w:val="26"/>
     </w:rPr>
@@ -2207,10 +2479,10 @@
       <w:outlineLvl w:val="2"/>
     </w:pPr>
     <w:rPr>
-      <w:rFonts w:asciiTheme="majorHAnsi" w:eastAsiaTheme="majorEastAsia" w:hAnsiTheme="majorHAnsi" w:cstheme="majorBidi"/>
+      <w:rFonts w:asciiTheme="majorHAnsi" w:eastAsiaTheme="majorEastAsia" w:hAnsiTheme="majorHAnsi" w:cstheme="majorBidi" w:ascii="Calibri" w:hAnsi="Calibri"/>
       <w:b/>
       <w:bCs/>
-      <w:color w:val="4F81BD" w:themeColor="accent1"/>
+      <w:color w:val="000000"/>
     </w:rPr>
   </w:style>
   <w:style w:type="paragraph" w:styleId="Heading4">

</xml_diff>